<commit_message>
Add smoke test script and update test documentation
- smoke_test_v2.sh: 5-step pre-trading validation pipeline
  (unit tests -> syntax check -> dry-run -> error scan -> summary)
- Updated test docs with Section 15: Smoke Test documentation
  (what it tests, error detection table, comparison vs unit tests)

Co-Authored-By: Claude Opus 4.6 <noreply@anthropic.com>
</commit_message>
<xml_diff>
--- a/PlaceOptionsSystemsV2_TestDocumentation.docx
+++ b/PlaceOptionsSystemsV2_TestDocumentation.docx
@@ -241,6 +241,17 @@
     </w:p>
     <w:p>
       <w:r>
+        <w:rPr>
+          <w:b/>
+        </w:rPr>
+        <w:t xml:space="preserve">15. </w:t>
+      </w:r>
+      <w:r>
+        <w:t>Smoke Test: End-to-End Dry-Run Validation</w:t>
+      </w:r>
+    </w:p>
+    <w:p>
+      <w:r>
         <w:br w:type="page"/>
       </w:r>
     </w:p>
@@ -14007,6 +14018,1248 @@
         <w:t xml:space="preserve">    )</w:t>
       </w:r>
     </w:p>
+    <w:p>
+      <w:r>
+        <w:br w:type="page"/>
+      </w:r>
+    </w:p>
+    <w:p>
+      <w:pPr>
+        <w:pStyle w:val="Heading1"/>
+      </w:pPr>
+      <w:r>
+        <w:t>15. Smoke Test: End-to-End Dry-Run Validation</w:t>
+      </w:r>
+    </w:p>
+    <w:p>
+      <w:r>
+        <w:rPr>
+          <w:b/>
+        </w:rPr>
+        <w:t xml:space="preserve">Purpose: </w:t>
+      </w:r>
+      <w:r>
+        <w:t>Run the full V2 system in --dry-run mode against the LIVE broker API to validate the complete flow before trading. Unlike unit tests (which mock everything), the smoke test uses real broker data, real contract names, real premiums, and real positions.</w:t>
+      </w:r>
+    </w:p>
+    <w:p>
+      <w:pPr>
+        <w:pStyle w:val="Heading2"/>
+      </w:pPr>
+      <w:r>
+        <w:t>What It Tests (that unit tests cannot)</w:t>
+      </w:r>
+    </w:p>
+    <w:p>
+      <w:pPr>
+        <w:pStyle w:val="ListBullet"/>
+      </w:pPr>
+      <w:r>
+        <w:t>Kite API connectivity and authentication (valid access token)</w:t>
+      </w:r>
+    </w:p>
+    <w:p>
+      <w:pPr>
+        <w:pStyle w:val="ListBullet"/>
+      </w:pPr>
+      <w:r>
+        <w:t>Real broker positions match V2 state (exact contract symbols)</w:t>
+      </w:r>
+    </w:p>
+    <w:p>
+      <w:pPr>
+        <w:pStyle w:val="ListBullet"/>
+      </w:pPr>
+      <w:r>
+        <w:t>Contract naming format (NIFTY2632423800CE vs NIFTY26MAR24300CE)</w:t>
+      </w:r>
+    </w:p>
+    <w:p>
+      <w:pPr>
+        <w:pStyle w:val="ListBullet"/>
+      </w:pPr>
+      <w:r>
+        <w:t>Real premium data feeds into position sizing correctly</w:t>
+      </w:r>
+    </w:p>
+    <w:p>
+      <w:pPr>
+        <w:pStyle w:val="ListBullet"/>
+      </w:pPr>
+      <w:r>
+        <w:t>ATM strike determination using live spot prices</w:t>
+      </w:r>
+    </w:p>
+    <w:p>
+      <w:pPr>
+        <w:pStyle w:val="ListBullet"/>
+      </w:pPr>
+      <w:r>
+        <w:t>Reconciliation against actual multi-system broker account</w:t>
+      </w:r>
+    </w:p>
+    <w:p>
+      <w:pPr>
+        <w:pStyle w:val="ListBullet"/>
+      </w:pPr>
+      <w:r>
+        <w:t>No Python exceptions in the full import chain (Directories, Holidays, etc.)</w:t>
+      </w:r>
+    </w:p>
+    <w:p>
+      <w:pPr>
+        <w:pStyle w:val="Heading2"/>
+      </w:pPr>
+      <w:r>
+        <w:t>How to Run</w:t>
+      </w:r>
+    </w:p>
+    <w:p>
+      <w:r>
+        <w:rPr>
+          <w:b/>
+        </w:rPr>
+        <w:t>Test all 4 strategies:</w:t>
+        <w:br/>
+      </w:r>
+      <w:r>
+        <w:rPr>
+          <w:rFonts w:ascii="Courier New" w:hAnsi="Courier New"/>
+          <w:sz w:val="20"/>
+        </w:rPr>
+        <w:t>./smoke_test_v2.sh</w:t>
+      </w:r>
+    </w:p>
+    <w:p>
+      <w:r>
+        <w:rPr>
+          <w:b/>
+        </w:rPr>
+        <w:t>Test a specific strategy:</w:t>
+        <w:br/>
+      </w:r>
+      <w:r>
+        <w:rPr>
+          <w:rFonts w:ascii="Courier New" w:hAnsi="Courier New"/>
+          <w:sz w:val="20"/>
+        </w:rPr>
+        <w:t>./smoke_test_v2.sh N_STD_4D_30SL_I</w:t>
+      </w:r>
+    </w:p>
+    <w:p>
+      <w:pPr>
+        <w:pStyle w:val="Heading2"/>
+      </w:pPr>
+      <w:r>
+        <w:t>5-Step Validation Pipeline</w:t>
+      </w:r>
+    </w:p>
+    <w:tbl>
+      <w:tblPr>
+        <w:tblStyle w:val="LightGrid-Accent1"/>
+        <w:tblW w:type="auto" w:w="0"/>
+        <w:jc w:val="center"/>
+        <w:tblLook w:firstColumn="1" w:firstRow="1" w:lastColumn="0" w:lastRow="0" w:noHBand="0" w:noVBand="1" w:val="04A0"/>
+      </w:tblPr>
+      <w:tblGrid>
+        <w:gridCol w:w="2880"/>
+        <w:gridCol w:w="2880"/>
+        <w:gridCol w:w="2880"/>
+      </w:tblGrid>
+      <w:tr>
+        <w:tc>
+          <w:tcPr>
+            <w:tcW w:type="dxa" w:w="2880"/>
+          </w:tcPr>
+          <w:p>
+            <w:r>
+              <w:rPr>
+                <w:b/>
+                <w:sz w:val="20"/>
+              </w:rPr>
+              <w:t>Step</w:t>
+            </w:r>
+          </w:p>
+        </w:tc>
+        <w:tc>
+          <w:tcPr>
+            <w:tcW w:type="dxa" w:w="2880"/>
+          </w:tcPr>
+          <w:p>
+            <w:r>
+              <w:rPr>
+                <w:b/>
+                <w:sz w:val="20"/>
+              </w:rPr>
+              <w:t>What It Does</w:t>
+            </w:r>
+          </w:p>
+        </w:tc>
+        <w:tc>
+          <w:tcPr>
+            <w:tcW w:type="dxa" w:w="2880"/>
+          </w:tcPr>
+          <w:p>
+            <w:r>
+              <w:rPr>
+                <w:b/>
+                <w:sz w:val="20"/>
+              </w:rPr>
+              <w:t>Pass Criteria</w:t>
+            </w:r>
+          </w:p>
+        </w:tc>
+      </w:tr>
+      <w:tr>
+        <w:tc>
+          <w:tcPr>
+            <w:tcW w:type="dxa" w:w="2880"/>
+          </w:tcPr>
+          <w:p>
+            <w:r>
+              <w:rPr>
+                <w:sz w:val="20"/>
+              </w:rPr>
+              <w:t>1. Unit Tests</w:t>
+            </w:r>
+          </w:p>
+        </w:tc>
+        <w:tc>
+          <w:tcPr>
+            <w:tcW w:type="dxa" w:w="2880"/>
+          </w:tcPr>
+          <w:p>
+            <w:r>
+              <w:rPr>
+                <w:sz w:val="20"/>
+              </w:rPr>
+              <w:t>Runs all 54 pytest unit + regression tests</w:t>
+            </w:r>
+          </w:p>
+        </w:tc>
+        <w:tc>
+          <w:tcPr>
+            <w:tcW w:type="dxa" w:w="2880"/>
+          </w:tcPr>
+          <w:p>
+            <w:r>
+              <w:rPr>
+                <w:sz w:val="20"/>
+              </w:rPr>
+              <w:t>All 54 pass (0 failures)</w:t>
+            </w:r>
+          </w:p>
+        </w:tc>
+      </w:tr>
+      <w:tr>
+        <w:tc>
+          <w:tcPr>
+            <w:tcW w:type="dxa" w:w="2880"/>
+          </w:tcPr>
+          <w:p>
+            <w:r>
+              <w:rPr>
+                <w:sz w:val="20"/>
+              </w:rPr>
+              <w:t>2. Syntax Check</w:t>
+            </w:r>
+          </w:p>
+        </w:tc>
+        <w:tc>
+          <w:tcPr>
+            <w:tcW w:type="dxa" w:w="2880"/>
+          </w:tcPr>
+          <w:p>
+            <w:r>
+              <w:rPr>
+                <w:sz w:val="20"/>
+              </w:rPr>
+              <w:t>Parses PlaceOptionsSystemsV2.py AST</w:t>
+            </w:r>
+          </w:p>
+        </w:tc>
+        <w:tc>
+          <w:tcPr>
+            <w:tcW w:type="dxa" w:w="2880"/>
+          </w:tcPr>
+          <w:p>
+            <w:r>
+              <w:rPr>
+                <w:sz w:val="20"/>
+              </w:rPr>
+              <w:t>No syntax errors</w:t>
+            </w:r>
+          </w:p>
+        </w:tc>
+      </w:tr>
+      <w:tr>
+        <w:tc>
+          <w:tcPr>
+            <w:tcW w:type="dxa" w:w="2880"/>
+          </w:tcPr>
+          <w:p>
+            <w:r>
+              <w:rPr>
+                <w:sz w:val="20"/>
+              </w:rPr>
+              <w:t>3. Dry-Run</w:t>
+            </w:r>
+          </w:p>
+        </w:tc>
+        <w:tc>
+          <w:tcPr>
+            <w:tcW w:type="dxa" w:w="2880"/>
+          </w:tcPr>
+          <w:p>
+            <w:r>
+              <w:rPr>
+                <w:sz w:val="20"/>
+              </w:rPr>
+              <w:t>Runs V2 with --dry-run and all overrides against live Kite API</w:t>
+            </w:r>
+          </w:p>
+        </w:tc>
+        <w:tc>
+          <w:tcPr>
+            <w:tcW w:type="dxa" w:w="2880"/>
+          </w:tcPr>
+          <w:p>
+            <w:r>
+              <w:rPr>
+                <w:sz w:val="20"/>
+              </w:rPr>
+              <w:t>Script completes without crash</w:t>
+            </w:r>
+          </w:p>
+        </w:tc>
+      </w:tr>
+      <w:tr>
+        <w:tc>
+          <w:tcPr>
+            <w:tcW w:type="dxa" w:w="2880"/>
+          </w:tcPr>
+          <w:p>
+            <w:r>
+              <w:rPr>
+                <w:sz w:val="20"/>
+              </w:rPr>
+              <w:t>4. Error Scan</w:t>
+            </w:r>
+          </w:p>
+        </w:tc>
+        <w:tc>
+          <w:tcPr>
+            <w:tcW w:type="dxa" w:w="2880"/>
+          </w:tcPr>
+          <w:p>
+            <w:r>
+              <w:rPr>
+                <w:sz w:val="20"/>
+              </w:rPr>
+              <w:t>Scans output for: Traceback, ABORTED, BLOCKED, repairRequired</w:t>
+            </w:r>
+          </w:p>
+        </w:tc>
+        <w:tc>
+          <w:tcPr>
+            <w:tcW w:type="dxa" w:w="2880"/>
+          </w:tcPr>
+          <w:p>
+            <w:r>
+              <w:rPr>
+                <w:sz w:val="20"/>
+              </w:rPr>
+              <w:t>No errors found (warnings OK)</w:t>
+            </w:r>
+          </w:p>
+        </w:tc>
+      </w:tr>
+      <w:tr>
+        <w:tc>
+          <w:tcPr>
+            <w:tcW w:type="dxa" w:w="2880"/>
+          </w:tcPr>
+          <w:p>
+            <w:r>
+              <w:rPr>
+                <w:sz w:val="20"/>
+              </w:rPr>
+              <w:t>5. Summary</w:t>
+            </w:r>
+          </w:p>
+        </w:tc>
+        <w:tc>
+          <w:tcPr>
+            <w:tcW w:type="dxa" w:w="2880"/>
+          </w:tcPr>
+          <w:p>
+            <w:r>
+              <w:rPr>
+                <w:sz w:val="20"/>
+              </w:rPr>
+              <w:t>Green = safe to go live, Red = fix before trading</w:t>
+            </w:r>
+          </w:p>
+        </w:tc>
+        <w:tc>
+          <w:tcPr>
+            <w:tcW w:type="dxa" w:w="2880"/>
+          </w:tcPr>
+          <w:p>
+            <w:r>
+              <w:rPr>
+                <w:sz w:val="20"/>
+              </w:rPr>
+              <w:t>SMOKE TEST PASSED</w:t>
+            </w:r>
+          </w:p>
+        </w:tc>
+      </w:tr>
+    </w:tbl>
+    <w:p>
+      <w:pPr>
+        <w:pStyle w:val="Heading2"/>
+      </w:pPr>
+      <w:r>
+        <w:t>Error Detection</w:t>
+      </w:r>
+    </w:p>
+    <w:p>
+      <w:r>
+        <w:rPr>
+          <w:b/>
+        </w:rPr>
+        <w:t>The smoke test scans dry-run output for these patterns:</w:t>
+      </w:r>
+    </w:p>
+    <w:tbl>
+      <w:tblPr>
+        <w:tblStyle w:val="LightGrid-Accent1"/>
+        <w:tblW w:type="auto" w:w="0"/>
+        <w:jc w:val="center"/>
+        <w:tblLook w:firstColumn="1" w:firstRow="1" w:lastColumn="0" w:lastRow="0" w:noHBand="0" w:noVBand="1" w:val="04A0"/>
+      </w:tblPr>
+      <w:tblGrid>
+        <w:gridCol w:w="2880"/>
+        <w:gridCol w:w="2880"/>
+        <w:gridCol w:w="2880"/>
+      </w:tblGrid>
+      <w:tr>
+        <w:tc>
+          <w:tcPr>
+            <w:tcW w:type="dxa" w:w="2880"/>
+          </w:tcPr>
+          <w:p>
+            <w:r>
+              <w:rPr>
+                <w:b/>
+                <w:sz w:val="20"/>
+              </w:rPr>
+              <w:t>Pattern</w:t>
+            </w:r>
+          </w:p>
+        </w:tc>
+        <w:tc>
+          <w:tcPr>
+            <w:tcW w:type="dxa" w:w="2880"/>
+          </w:tcPr>
+          <w:p>
+            <w:r>
+              <w:rPr>
+                <w:b/>
+                <w:sz w:val="20"/>
+              </w:rPr>
+              <w:t>Severity</w:t>
+            </w:r>
+          </w:p>
+        </w:tc>
+        <w:tc>
+          <w:tcPr>
+            <w:tcW w:type="dxa" w:w="2880"/>
+          </w:tcPr>
+          <w:p>
+            <w:r>
+              <w:rPr>
+                <w:b/>
+                <w:sz w:val="20"/>
+              </w:rPr>
+              <w:t>Meaning</w:t>
+            </w:r>
+          </w:p>
+        </w:tc>
+      </w:tr>
+      <w:tr>
+        <w:tc>
+          <w:tcPr>
+            <w:tcW w:type="dxa" w:w="2880"/>
+          </w:tcPr>
+          <w:p>
+            <w:r>
+              <w:rPr>
+                <w:sz w:val="20"/>
+              </w:rPr>
+              <w:t>Traceback / Exception</w:t>
+            </w:r>
+          </w:p>
+        </w:tc>
+        <w:tc>
+          <w:tcPr>
+            <w:tcW w:type="dxa" w:w="2880"/>
+          </w:tcPr>
+          <w:p>
+            <w:r>
+              <w:rPr>
+                <w:sz w:val="20"/>
+              </w:rPr>
+              <w:t>FAIL</w:t>
+            </w:r>
+          </w:p>
+        </w:tc>
+        <w:tc>
+          <w:tcPr>
+            <w:tcW w:type="dxa" w:w="2880"/>
+          </w:tcPr>
+          <w:p>
+            <w:r>
+              <w:rPr>
+                <w:sz w:val="20"/>
+              </w:rPr>
+              <w:t>Python crash — code bug or missing dependency</w:t>
+            </w:r>
+          </w:p>
+        </w:tc>
+      </w:tr>
+      <w:tr>
+        <w:tc>
+          <w:tcPr>
+            <w:tcW w:type="dxa" w:w="2880"/>
+          </w:tcPr>
+          <w:p>
+            <w:r>
+              <w:rPr>
+                <w:sz w:val="20"/>
+              </w:rPr>
+              <w:t>ABORTED</w:t>
+            </w:r>
+          </w:p>
+        </w:tc>
+        <w:tc>
+          <w:tcPr>
+            <w:tcW w:type="dxa" w:w="2880"/>
+          </w:tcPr>
+          <w:p>
+            <w:r>
+              <w:rPr>
+                <w:sz w:val="20"/>
+              </w:rPr>
+              <w:t>FAIL</w:t>
+            </w:r>
+          </w:p>
+        </w:tc>
+        <w:tc>
+          <w:tcPr>
+            <w:tcW w:type="dxa" w:w="2880"/>
+          </w:tcPr>
+          <w:p>
+            <w:r>
+              <w:rPr>
+                <w:sz w:val="20"/>
+              </w:rPr>
+              <w:t>Exit pre-flight detected danger (e.g., position already flat)</w:t>
+            </w:r>
+          </w:p>
+        </w:tc>
+      </w:tr>
+      <w:tr>
+        <w:tc>
+          <w:tcPr>
+            <w:tcW w:type="dxa" w:w="2880"/>
+          </w:tcPr>
+          <w:p>
+            <w:r>
+              <w:rPr>
+                <w:sz w:val="20"/>
+              </w:rPr>
+              <w:t>BLOCKED</w:t>
+            </w:r>
+          </w:p>
+        </w:tc>
+        <w:tc>
+          <w:tcPr>
+            <w:tcW w:type="dxa" w:w="2880"/>
+          </w:tcPr>
+          <w:p>
+            <w:r>
+              <w:rPr>
+                <w:sz w:val="20"/>
+              </w:rPr>
+              <w:t>WARN</w:t>
+            </w:r>
+          </w:p>
+        </w:tc>
+        <w:tc>
+          <w:tcPr>
+            <w:tcW w:type="dxa" w:w="2880"/>
+          </w:tcPr>
+          <w:p>
+            <w:r>
+              <w:rPr>
+                <w:sz w:val="20"/>
+              </w:rPr>
+              <w:t>Strategy entry blocked by state (may be expected if position is already open)</w:t>
+            </w:r>
+          </w:p>
+        </w:tc>
+      </w:tr>
+      <w:tr>
+        <w:tc>
+          <w:tcPr>
+            <w:tcW w:type="dxa" w:w="2880"/>
+          </w:tcPr>
+          <w:p>
+            <w:r>
+              <w:rPr>
+                <w:sz w:val="20"/>
+              </w:rPr>
+              <w:t>repairRequired</w:t>
+            </w:r>
+          </w:p>
+        </w:tc>
+        <w:tc>
+          <w:tcPr>
+            <w:tcW w:type="dxa" w:w="2880"/>
+          </w:tcPr>
+          <w:p>
+            <w:r>
+              <w:rPr>
+                <w:sz w:val="20"/>
+              </w:rPr>
+              <w:t>WARN</w:t>
+            </w:r>
+          </w:p>
+        </w:tc>
+        <w:tc>
+          <w:tcPr>
+            <w:tcW w:type="dxa" w:w="2880"/>
+          </w:tcPr>
+          <w:p>
+            <w:r>
+              <w:rPr>
+                <w:sz w:val="20"/>
+              </w:rPr>
+              <w:t>State corruption detected — needs manual intervention</w:t>
+            </w:r>
+          </w:p>
+        </w:tc>
+      </w:tr>
+      <w:tr>
+        <w:tc>
+          <w:tcPr>
+            <w:tcW w:type="dxa" w:w="2880"/>
+          </w:tcPr>
+          <w:p>
+            <w:r>
+              <w:rPr>
+                <w:sz w:val="20"/>
+              </w:rPr>
+              <w:t>GTT cancel failed</w:t>
+            </w:r>
+          </w:p>
+        </w:tc>
+        <w:tc>
+          <w:tcPr>
+            <w:tcW w:type="dxa" w:w="2880"/>
+          </w:tcPr>
+          <w:p>
+            <w:r>
+              <w:rPr>
+                <w:sz w:val="20"/>
+              </w:rPr>
+              <w:t>WARN</w:t>
+            </w:r>
+          </w:p>
+        </w:tc>
+        <w:tc>
+          <w:tcPr>
+            <w:tcW w:type="dxa" w:w="2880"/>
+          </w:tcPr>
+          <w:p>
+            <w:r>
+              <w:rPr>
+                <w:sz w:val="20"/>
+              </w:rPr>
+              <w:t>GTT cleanup issue — logged but non-blocking</w:t>
+            </w:r>
+          </w:p>
+        </w:tc>
+      </w:tr>
+    </w:tbl>
+    <w:p>
+      <w:pPr>
+        <w:pStyle w:val="Heading2"/>
+      </w:pPr>
+      <w:r>
+        <w:t>When to Run</w:t>
+      </w:r>
+    </w:p>
+    <w:p>
+      <w:pPr>
+        <w:pStyle w:val="ListBullet"/>
+      </w:pPr>
+      <w:r>
+        <w:t>Before every live trading session (morning before 09:30 IST)</w:t>
+      </w:r>
+    </w:p>
+    <w:p>
+      <w:pPr>
+        <w:pStyle w:val="ListBullet"/>
+      </w:pPr>
+      <w:r>
+        <w:t>After any code change to PlaceOptionsSystemsV2.py</w:t>
+      </w:r>
+    </w:p>
+    <w:p>
+      <w:pPr>
+        <w:pStyle w:val="ListBullet"/>
+      </w:pPr>
+      <w:r>
+        <w:t>After updating access tokens (Auto3_Fetch_Accesstoken.py)</w:t>
+      </w:r>
+    </w:p>
+    <w:p>
+      <w:pPr>
+        <w:pStyle w:val="ListBullet"/>
+      </w:pPr>
+      <w:r>
+        <w:t>After manual state file edits (v2_state.json)</w:t>
+      </w:r>
+    </w:p>
+    <w:p>
+      <w:pPr>
+        <w:pStyle w:val="ListBullet"/>
+      </w:pPr>
+      <w:r>
+        <w:t>After a production bug fix (verify the fix doesn't break anything else)</w:t>
+      </w:r>
+    </w:p>
+    <w:p>
+      <w:pPr>
+        <w:pStyle w:val="Heading2"/>
+      </w:pPr>
+      <w:r>
+        <w:t>Unit Tests vs Smoke Test vs Live Trading</w:t>
+      </w:r>
+    </w:p>
+    <w:tbl>
+      <w:tblPr>
+        <w:tblStyle w:val="LightGrid-Accent1"/>
+        <w:tblW w:type="auto" w:w="0"/>
+        <w:jc w:val="center"/>
+        <w:tblLook w:firstColumn="1" w:firstRow="1" w:lastColumn="0" w:lastRow="0" w:noHBand="0" w:noVBand="1" w:val="04A0"/>
+      </w:tblPr>
+      <w:tblGrid>
+        <w:gridCol w:w="2160"/>
+        <w:gridCol w:w="2160"/>
+        <w:gridCol w:w="2160"/>
+        <w:gridCol w:w="2160"/>
+      </w:tblGrid>
+      <w:tr>
+        <w:tc>
+          <w:tcPr>
+            <w:tcW w:type="dxa" w:w="2160"/>
+          </w:tcPr>
+          <w:p>
+            <w:r>
+              <w:rPr>
+                <w:b/>
+                <w:sz w:val="18"/>
+              </w:rPr>
+            </w:r>
+          </w:p>
+        </w:tc>
+        <w:tc>
+          <w:tcPr>
+            <w:tcW w:type="dxa" w:w="2160"/>
+          </w:tcPr>
+          <w:p>
+            <w:r>
+              <w:rPr>
+                <w:b/>
+                <w:sz w:val="18"/>
+              </w:rPr>
+              <w:t>Unit Tests</w:t>
+            </w:r>
+          </w:p>
+        </w:tc>
+        <w:tc>
+          <w:tcPr>
+            <w:tcW w:type="dxa" w:w="2160"/>
+          </w:tcPr>
+          <w:p>
+            <w:r>
+              <w:rPr>
+                <w:b/>
+                <w:sz w:val="18"/>
+              </w:rPr>
+              <w:t>Smoke Test</w:t>
+            </w:r>
+          </w:p>
+        </w:tc>
+        <w:tc>
+          <w:tcPr>
+            <w:tcW w:type="dxa" w:w="2160"/>
+          </w:tcPr>
+          <w:p>
+            <w:r>
+              <w:rPr>
+                <w:b/>
+                <w:sz w:val="18"/>
+              </w:rPr>
+              <w:t>Live Trading</w:t>
+            </w:r>
+          </w:p>
+        </w:tc>
+      </w:tr>
+      <w:tr>
+        <w:tc>
+          <w:tcPr>
+            <w:tcW w:type="dxa" w:w="2160"/>
+          </w:tcPr>
+          <w:p>
+            <w:r>
+              <w:rPr>
+                <w:sz w:val="18"/>
+              </w:rPr>
+              <w:t>Needs broker?</w:t>
+            </w:r>
+          </w:p>
+        </w:tc>
+        <w:tc>
+          <w:tcPr>
+            <w:tcW w:type="dxa" w:w="2160"/>
+          </w:tcPr>
+          <w:p>
+            <w:r>
+              <w:rPr>
+                <w:sz w:val="18"/>
+              </w:rPr>
+              <w:t>No</w:t>
+            </w:r>
+          </w:p>
+        </w:tc>
+        <w:tc>
+          <w:tcPr>
+            <w:tcW w:type="dxa" w:w="2160"/>
+          </w:tcPr>
+          <w:p>
+            <w:r>
+              <w:rPr>
+                <w:sz w:val="18"/>
+              </w:rPr>
+              <w:t>Yes (read-only)</w:t>
+            </w:r>
+          </w:p>
+        </w:tc>
+        <w:tc>
+          <w:tcPr>
+            <w:tcW w:type="dxa" w:w="2160"/>
+          </w:tcPr>
+          <w:p>
+            <w:r>
+              <w:rPr>
+                <w:sz w:val="18"/>
+              </w:rPr>
+              <w:t>Yes (read + write)</w:t>
+            </w:r>
+          </w:p>
+        </w:tc>
+      </w:tr>
+      <w:tr>
+        <w:tc>
+          <w:tcPr>
+            <w:tcW w:type="dxa" w:w="2160"/>
+          </w:tcPr>
+          <w:p>
+            <w:r>
+              <w:rPr>
+                <w:sz w:val="18"/>
+              </w:rPr>
+              <w:t>Places orders?</w:t>
+            </w:r>
+          </w:p>
+        </w:tc>
+        <w:tc>
+          <w:tcPr>
+            <w:tcW w:type="dxa" w:w="2160"/>
+          </w:tcPr>
+          <w:p>
+            <w:r>
+              <w:rPr>
+                <w:sz w:val="18"/>
+              </w:rPr>
+              <w:t>No</w:t>
+            </w:r>
+          </w:p>
+        </w:tc>
+        <w:tc>
+          <w:tcPr>
+            <w:tcW w:type="dxa" w:w="2160"/>
+          </w:tcPr>
+          <w:p>
+            <w:r>
+              <w:rPr>
+                <w:sz w:val="18"/>
+              </w:rPr>
+              <w:t>No (dry-run)</w:t>
+            </w:r>
+          </w:p>
+        </w:tc>
+        <w:tc>
+          <w:tcPr>
+            <w:tcW w:type="dxa" w:w="2160"/>
+          </w:tcPr>
+          <w:p>
+            <w:r>
+              <w:rPr>
+                <w:sz w:val="18"/>
+              </w:rPr>
+              <w:t>Yes (real money)</w:t>
+            </w:r>
+          </w:p>
+        </w:tc>
+      </w:tr>
+      <w:tr>
+        <w:tc>
+          <w:tcPr>
+            <w:tcW w:type="dxa" w:w="2160"/>
+          </w:tcPr>
+          <w:p>
+            <w:r>
+              <w:rPr>
+                <w:sz w:val="18"/>
+              </w:rPr>
+              <w:t>Speed</w:t>
+            </w:r>
+          </w:p>
+        </w:tc>
+        <w:tc>
+          <w:tcPr>
+            <w:tcW w:type="dxa" w:w="2160"/>
+          </w:tcPr>
+          <w:p>
+            <w:r>
+              <w:rPr>
+                <w:sz w:val="18"/>
+              </w:rPr>
+              <w:t>3 seconds</w:t>
+            </w:r>
+          </w:p>
+        </w:tc>
+        <w:tc>
+          <w:tcPr>
+            <w:tcW w:type="dxa" w:w="2160"/>
+          </w:tcPr>
+          <w:p>
+            <w:r>
+              <w:rPr>
+                <w:sz w:val="18"/>
+              </w:rPr>
+              <w:t>5-10 seconds</w:t>
+            </w:r>
+          </w:p>
+        </w:tc>
+        <w:tc>
+          <w:tcPr>
+            <w:tcW w:type="dxa" w:w="2160"/>
+          </w:tcPr>
+          <w:p>
+            <w:r>
+              <w:rPr>
+                <w:sz w:val="18"/>
+              </w:rPr>
+              <w:t>N/A</w:t>
+            </w:r>
+          </w:p>
+        </w:tc>
+      </w:tr>
+      <w:tr>
+        <w:tc>
+          <w:tcPr>
+            <w:tcW w:type="dxa" w:w="2160"/>
+          </w:tcPr>
+          <w:p>
+            <w:r>
+              <w:rPr>
+                <w:sz w:val="18"/>
+              </w:rPr>
+              <w:t>Runs offline?</w:t>
+            </w:r>
+          </w:p>
+        </w:tc>
+        <w:tc>
+          <w:tcPr>
+            <w:tcW w:type="dxa" w:w="2160"/>
+          </w:tcPr>
+          <w:p>
+            <w:r>
+              <w:rPr>
+                <w:sz w:val="18"/>
+              </w:rPr>
+              <w:t>Yes</w:t>
+            </w:r>
+          </w:p>
+        </w:tc>
+        <w:tc>
+          <w:tcPr>
+            <w:tcW w:type="dxa" w:w="2160"/>
+          </w:tcPr>
+          <w:p>
+            <w:r>
+              <w:rPr>
+                <w:sz w:val="18"/>
+              </w:rPr>
+              <w:t>No</w:t>
+            </w:r>
+          </w:p>
+        </w:tc>
+        <w:tc>
+          <w:tcPr>
+            <w:tcW w:type="dxa" w:w="2160"/>
+          </w:tcPr>
+          <w:p>
+            <w:r>
+              <w:rPr>
+                <w:sz w:val="18"/>
+              </w:rPr>
+              <w:t>No</w:t>
+            </w:r>
+          </w:p>
+        </w:tc>
+      </w:tr>
+      <w:tr>
+        <w:tc>
+          <w:tcPr>
+            <w:tcW w:type="dxa" w:w="2160"/>
+          </w:tcPr>
+          <w:p>
+            <w:r>
+              <w:rPr>
+                <w:sz w:val="18"/>
+              </w:rPr>
+              <w:t>Tests math/logic?</w:t>
+            </w:r>
+          </w:p>
+        </w:tc>
+        <w:tc>
+          <w:tcPr>
+            <w:tcW w:type="dxa" w:w="2160"/>
+          </w:tcPr>
+          <w:p>
+            <w:r>
+              <w:rPr>
+                <w:sz w:val="18"/>
+              </w:rPr>
+              <w:t>Yes</w:t>
+            </w:r>
+          </w:p>
+        </w:tc>
+        <w:tc>
+          <w:tcPr>
+            <w:tcW w:type="dxa" w:w="2160"/>
+          </w:tcPr>
+          <w:p>
+            <w:r>
+              <w:rPr>
+                <w:sz w:val="18"/>
+              </w:rPr>
+              <w:t>Indirectly</w:t>
+            </w:r>
+          </w:p>
+        </w:tc>
+        <w:tc>
+          <w:tcPr>
+            <w:tcW w:type="dxa" w:w="2160"/>
+          </w:tcPr>
+          <w:p>
+            <w:r>
+              <w:rPr>
+                <w:sz w:val="18"/>
+              </w:rPr>
+              <w:t>Indirectly</w:t>
+            </w:r>
+          </w:p>
+        </w:tc>
+      </w:tr>
+      <w:tr>
+        <w:tc>
+          <w:tcPr>
+            <w:tcW w:type="dxa" w:w="2160"/>
+          </w:tcPr>
+          <w:p>
+            <w:r>
+              <w:rPr>
+                <w:sz w:val="18"/>
+              </w:rPr>
+              <w:t>Tests API format?</w:t>
+            </w:r>
+          </w:p>
+        </w:tc>
+        <w:tc>
+          <w:tcPr>
+            <w:tcW w:type="dxa" w:w="2160"/>
+          </w:tcPr>
+          <w:p>
+            <w:r>
+              <w:rPr>
+                <w:sz w:val="18"/>
+              </w:rPr>
+              <w:t>No (mocked)</w:t>
+            </w:r>
+          </w:p>
+        </w:tc>
+        <w:tc>
+          <w:tcPr>
+            <w:tcW w:type="dxa" w:w="2160"/>
+          </w:tcPr>
+          <w:p>
+            <w:r>
+              <w:rPr>
+                <w:sz w:val="18"/>
+              </w:rPr>
+              <w:t>Yes (real data)</w:t>
+            </w:r>
+          </w:p>
+        </w:tc>
+        <w:tc>
+          <w:tcPr>
+            <w:tcW w:type="dxa" w:w="2160"/>
+          </w:tcPr>
+          <w:p>
+            <w:r>
+              <w:rPr>
+                <w:sz w:val="18"/>
+              </w:rPr>
+              <w:t>Yes (real data)</w:t>
+            </w:r>
+          </w:p>
+        </w:tc>
+      </w:tr>
+      <w:tr>
+        <w:tc>
+          <w:tcPr>
+            <w:tcW w:type="dxa" w:w="2160"/>
+          </w:tcPr>
+          <w:p>
+            <w:r>
+              <w:rPr>
+                <w:sz w:val="18"/>
+              </w:rPr>
+              <w:t>Tests order fills?</w:t>
+            </w:r>
+          </w:p>
+        </w:tc>
+        <w:tc>
+          <w:tcPr>
+            <w:tcW w:type="dxa" w:w="2160"/>
+          </w:tcPr>
+          <w:p>
+            <w:r>
+              <w:rPr>
+                <w:sz w:val="18"/>
+              </w:rPr>
+              <w:t>No</w:t>
+            </w:r>
+          </w:p>
+        </w:tc>
+        <w:tc>
+          <w:tcPr>
+            <w:tcW w:type="dxa" w:w="2160"/>
+          </w:tcPr>
+          <w:p>
+            <w:r>
+              <w:rPr>
+                <w:sz w:val="18"/>
+              </w:rPr>
+              <w:t>No</w:t>
+            </w:r>
+          </w:p>
+        </w:tc>
+        <w:tc>
+          <w:tcPr>
+            <w:tcW w:type="dxa" w:w="2160"/>
+          </w:tcPr>
+          <w:p>
+            <w:r>
+              <w:rPr>
+                <w:sz w:val="18"/>
+              </w:rPr>
+              <w:t>Yes</w:t>
+            </w:r>
+          </w:p>
+        </w:tc>
+      </w:tr>
+    </w:tbl>
+    <w:p>
+      <w:pPr>
+        <w:pStyle w:val="Heading2"/>
+      </w:pPr>
+      <w:r>
+        <w:t>Sample Output (Passing)</w:t>
+      </w:r>
+    </w:p>
+    <w:p>
+      <w:r>
+        <w:rPr>
+          <w:rFonts w:ascii="Courier New" w:hAnsi="Courier New"/>
+          <w:sz w:val="16"/>
+        </w:rPr>
+        <w:t>$ ./smoke_test_v2.sh</w:t>
+        <w:br/>
+        <w:t>===============================================</w:t>
+        <w:br/>
+        <w:t xml:space="preserve">  V2 Smoke Test - 2026-03-22 17:10:04</w:t>
+        <w:br/>
+        <w:t>===============================================</w:t>
+        <w:br/>
+        <w:br/>
+        <w:t>Step 1: Running unit tests...</w:t>
+        <w:br/>
+        <w:t>54 passed in 3.11s</w:t>
+        <w:br/>
+        <w:t>PASS: All unit tests passed</w:t>
+        <w:br/>
+        <w:br/>
+        <w:t>Step 2: Syntax check...</w:t>
+        <w:br/>
+        <w:t>OK</w:t>
+        <w:br/>
+        <w:t>PASS: Syntax OK</w:t>
+        <w:br/>
+        <w:br/>
+        <w:t>Step 3: Running dry-run...</w:t>
+        <w:br/>
+        <w:t>[V2 RUNNER] Starting at 2026-03-22T17:10:10 (mode=DRY RUN)</w:t>
+        <w:br/>
+        <w:t>[RECONCILE] NIFTY: OK (contracts verified: {23100CE: -130, 23100PE: -130})</w:t>
+        <w:br/>
+        <w:t>[RECONCILE] SENSEX: OK (contracts verified: {74400CE: -40, 74400PE: -40})</w:t>
+        <w:br/>
+        <w:t>[V2 RUNNER] Completed</w:t>
+        <w:br/>
+        <w:br/>
+        <w:t>Step 4: Checking output for errors...</w:t>
+        <w:br/>
+        <w:t xml:space="preserve">  OK: Reconciliation ran</w:t>
+        <w:br/>
+        <w:br/>
+        <w:t>===============================================</w:t>
+        <w:br/>
+        <w:t xml:space="preserve">  SMOKE TEST PASSED - safe to go live</w:t>
+        <w:br/>
+        <w:t>===============================================</w:t>
+      </w:r>
+    </w:p>
+    <w:p/>
     <w:sectPr>
       <w:pgSz w:w="12240" w:h="15840"/>
       <w:pgMar w:top="1440" w:right="1800" w:bottom="1440" w:left="1800" w:header="720" w:footer="720" w:gutter="0"/>

</xml_diff>